<commit_message>
Kaggle Notebook | Genome Privacy Attack simulation | Privacy defence added
</commit_message>
<xml_diff>
--- a/Full process.docx
+++ b/Full process.docx
@@ -154,6 +154,17 @@
       </w:r>
     </w:p>
     <w:p>
+      <w:pPr>
+        <w:ind w:left="360"/>
+      </w:pPr>
+      <w:r>
+        <w:t>After</w:t>
+      </w:r>
+      <w:r>
+        <w:t xml:space="preserve"> adding the data attack on the data and save the result</w:t>
+      </w:r>
+    </w:p>
+    <w:p>
       <w:r>
         <w:rPr>
           <w:b/>
@@ -194,6 +205,39 @@
     </w:p>
     <w:p>
       <w:pPr>
+        <w:ind w:left="360"/>
+      </w:pPr>
+      <w:r>
+        <w:t>After</w:t>
+      </w:r>
+      <w:r>
+        <w:t xml:space="preserve"> adding the data attack on the data and save the result</w:t>
+      </w:r>
+    </w:p>
+    <w:p/>
+    <w:p>
+      <w:r>
+        <w:t xml:space="preserve">At last use both defense on the data and implement the attack </w:t>
+      </w:r>
+      <w:proofErr w:type="spellStart"/>
+      <w:r>
+        <w:t>againa</w:t>
+      </w:r>
+      <w:proofErr w:type="spellEnd"/>
+      <w:r>
+        <w:t xml:space="preserve"> </w:t>
+      </w:r>
+      <w:proofErr w:type="spellStart"/>
+      <w:r>
+        <w:t>dn</w:t>
+      </w:r>
+      <w:proofErr w:type="spellEnd"/>
+      <w:r>
+        <w:t xml:space="preserve"> save the result.</w:t>
+      </w:r>
+    </w:p>
+    <w:p>
+      <w:pPr>
         <w:rPr>
           <w:b/>
           <w:bCs/>
@@ -374,16 +418,13 @@
     </w:p>
     <w:p>
       <w:r>
+        <w:lastRenderedPageBreak/>
         <w:t xml:space="preserve">Your presentation states that the final deliverable will be a small results dashboard showing before-and-after charts. </w:t>
       </w:r>
     </w:p>
     <w:p>
       <w:r>
-        <w:t xml:space="preserve">To finish the simulation, you will measure the "Attack Success Rate". You will record the percentage of times the hacker guessed correctly on the unprotected data, and compare it to the percentage of correct guesses after applying differential privacy or synthetic data. You can </w:t>
-      </w:r>
-      <w:r>
-        <w:lastRenderedPageBreak/>
-        <w:t xml:space="preserve">use standard Python charting tools like </w:t>
+        <w:t xml:space="preserve">To finish the simulation, you will measure the "Attack Success Rate". You will record the percentage of times the hacker guessed correctly on the unprotected data, and compare it to the percentage of correct guesses after applying differential privacy or synthetic data. You can use standard Python charting tools like </w:t>
       </w:r>
       <w:r>
         <w:rPr>
@@ -1596,6 +1637,7 @@
   <w:style w:type="paragraph" w:default="1" w:styleId="Normal">
     <w:name w:val="Normal"/>
     <w:qFormat/>
+    <w:rsid w:val="004C21CF"/>
   </w:style>
   <w:style w:type="paragraph" w:styleId="Heading1">
     <w:name w:val="heading 1"/>
@@ -1799,6 +1841,7 @@
   <w:style w:type="character" w:default="1" w:styleId="DefaultParagraphFont">
     <w:name w:val="Default Paragraph Font"/>
     <w:uiPriority w:val="1"/>
+    <w:semiHidden/>
     <w:unhideWhenUsed/>
   </w:style>
   <w:style w:type="table" w:default="1" w:styleId="TableNormal">

</xml_diff>